<commit_message>
perf: kompresi template surat dispensasi menjadi ~50 KB dan aktifkan kompresi DEFLATE
</commit_message>
<xml_diff>
--- a/public/dispensasi.docx
+++ b/public/dispensasi.docx
@@ -1,5 +1,56 @@
 
-<file path=word/document.xml><?xml version="1.0" encoding="utf-8"?>
+<file path=docProps\app.xml><?xml version="1.0" encoding="utf-8"?>
+<Properties xmlns="http://schemas.openxmlformats.org/officeDocument/2006/extended-properties" xmlns:vt="http://schemas.openxmlformats.org/officeDocument/2006/docPropsVTypes">
+  <Template>Normal.dotm</Template>
+  <TotalTime>114</TotalTime>
+  <Pages>1</Pages>
+  <Words>126</Words>
+  <Characters>719</Characters>
+  <Application>Microsoft Office Word</Application>
+  <DocSecurity>0</DocSecurity>
+  <Lines>5</Lines>
+  <Paragraphs>1</Paragraphs>
+  <ScaleCrop>false</ScaleCrop>
+  <HeadingPairs>
+    <vt:vector size="2" baseType="variant">
+      <vt:variant>
+        <vt:lpstr>Title</vt:lpstr>
+      </vt:variant>
+      <vt:variant>
+        <vt:i4>1</vt:i4>
+      </vt:variant>
+    </vt:vector>
+  </HeadingPairs>
+  <TitlesOfParts>
+    <vt:vector size="1" baseType="lpstr">
+      <vt:lpstr/>
+    </vt:vector>
+  </TitlesOfParts>
+  <Company/>
+  <LinksUpToDate>false</LinksUpToDate>
+  <CharactersWithSpaces>844</CharactersWithSpaces>
+  <SharedDoc>false</SharedDoc>
+  <HyperlinksChanged>false</HyperlinksChanged>
+  <AppVersion>16.0000</AppVersion>
+</Properties>
+</file>
+
+<file path=docProps\core.xml><?xml version="1.0" encoding="utf-8"?>
+<cp:coreProperties xmlns:cp="http://schemas.openxmlformats.org/package/2006/metadata/core-properties" xmlns:dc="http://purl.org/dc/elements/1.1/" xmlns:dcterms="http://purl.org/dc/terms/" xmlns:dcmitype="http://purl.org/dc/dcmitype/" xmlns:xsi="http://www.w3.org/2001/XMLSchema-instance">
+  <dc:title/>
+  <dc:subject/>
+  <dc:creator>Informasi</dc:creator>
+  <cp:keywords/>
+  <dc:description/>
+  <cp:lastModifiedBy>user</cp:lastModifiedBy>
+  <cp:revision>7</cp:revision>
+  <cp:lastPrinted>2026-07-24T04:38:00Z</cp:lastPrinted>
+  <dcterms:created xsi:type="dcterms:W3CDTF">2026-08-07T00:54:00Z</dcterms:created>
+  <dcterms:modified xsi:type="dcterms:W3CDTF">2026-08-07T05:44:00Z</dcterms:modified>
+</cp:coreProperties>
+</file>
+
+<file path=word\document.xml><?xml version="1.0" encoding="utf-8"?>
 <w:document xmlns:wpc="http://schemas.microsoft.com/office/word/2010/wordprocessingCanvas" xmlns:cx="http://schemas.microsoft.com/office/drawing/2014/chartex" xmlns:cx1="http://schemas.microsoft.com/office/drawing/2015/9/8/chartex" xmlns:cx2="http://schemas.microsoft.com/office/drawing/2015/10/21/chartex" xmlns:cx3="http://schemas.microsoft.com/office/drawing/2016/5/9/chartex" xmlns:cx4="http://schemas.microsoft.com/office/drawing/2016/5/10/chartex" xmlns:cx5="http://schemas.microsoft.com/office/drawing/2016/5/11/chartex" xmlns:cx6="http://schemas.microsoft.com/office/drawing/2016/5/12/chartex" xmlns:cx7="http://schemas.microsoft.com/office/drawing/2016/5/13/chartex" xmlns:cx8="http://schemas.microsoft.com/office/drawing/2016/5/14/chartex" xmlns:mc="http://schemas.openxmlformats.org/markup-compatibility/2006" xmlns:aink="http://schemas.microsoft.com/office/drawing/2016/ink" xmlns:am3d="http://schemas.microsoft.com/office/drawing/2017/model3d" xmlns:o="urn:schemas-microsoft-com:office:office" xmlns:oel="http://schemas.microsoft.com/office/2019/extlst" xmlns:r="http://schemas.openxmlformats.org/officeDocument/2006/relationships" xmlns:m="http://schemas.openxmlformats.org/officeDocument/2006/math" xmlns:v="urn:schemas-microsoft-com:vml" xmlns:wp14="http://schemas.microsoft.com/office/word/2010/wordprocessingDrawing" xmlns:wp="http://schemas.openxmlformats.org/drawingml/2006/wordprocessingDrawing" xmlns:w10="urn:schemas-microsoft-com:office:word" xmlns:w="http://schemas.openxmlformats.org/wordprocessingml/2006/main" xmlns:w14="http://schemas.microsoft.com/office/word/2010/wordml" xmlns:w15="http://schemas.microsoft.com/office/word/2012/wordml" xmlns:w16cex="http://schemas.microsoft.com/office/word/2018/wordml/cex" xmlns:w16cid="http://schemas.microsoft.com/office/word/2016/wordml/cid" xmlns:w16="http://schemas.microsoft.com/office/word/2018/wordml" xmlns:w16du="http://schemas.microsoft.com/office/word/2023/wordml/word16du" xmlns:w16sdtdh="http://schemas.microsoft.com/office/word/2020/wordml/sdtdatahash" xmlns:w16sdtfl="http://schemas.microsoft.com/office/word/2024/wordml/sdtformatlock" xmlns:w16se="http://schemas.microsoft.com/office/word/2015/wordml/symex" xmlns:wpg="http://schemas.microsoft.com/office/word/2010/wordprocessingGroup" xmlns:wpi="http://schemas.microsoft.com/office/word/2010/wordprocessingInk" xmlns:wne="http://schemas.microsoft.com/office/word/2006/wordml" xmlns:wps="http://schemas.microsoft.com/office/word/2010/wordprocessingShape" mc:Ignorable="w14 w15 w16se w16cid w16 w16cex w16sdtdh w16sdtfl w16du wp14">
   <w:body>
     <w:p>
@@ -1256,7 +1307,7 @@
 </w:document>
 </file>
 
-<file path=word/endnotes.xml><?xml version="1.0" encoding="utf-8"?>
+<file path=word\endnotes.xml><?xml version="1.0" encoding="utf-8"?>
 <w:endnotes xmlns:wpc="http://schemas.microsoft.com/office/word/2010/wordprocessingCanvas" xmlns:cx="http://schemas.microsoft.com/office/drawing/2014/chartex" xmlns:cx1="http://schemas.microsoft.com/office/drawing/2015/9/8/chartex" xmlns:cx2="http://schemas.microsoft.com/office/drawing/2015/10/21/chartex" xmlns:cx3="http://schemas.microsoft.com/office/drawing/2016/5/9/chartex" xmlns:cx4="http://schemas.microsoft.com/office/drawing/2016/5/10/chartex" xmlns:cx5="http://schemas.microsoft.com/office/drawing/2016/5/11/chartex" xmlns:cx6="http://schemas.microsoft.com/office/drawing/2016/5/12/chartex" xmlns:cx7="http://schemas.microsoft.com/office/drawing/2016/5/13/chartex" xmlns:cx8="http://schemas.microsoft.com/office/drawing/2016/5/14/chartex" xmlns:mc="http://schemas.openxmlformats.org/markup-compatibility/2006" xmlns:aink="http://schemas.microsoft.com/office/drawing/2016/ink" xmlns:am3d="http://schemas.microsoft.com/office/drawing/2017/model3d" xmlns:o="urn:schemas-microsoft-com:office:office" xmlns:oel="http://schemas.microsoft.com/office/2019/extlst" xmlns:r="http://schemas.openxmlformats.org/officeDocument/2006/relationships" xmlns:m="http://schemas.openxmlformats.org/officeDocument/2006/math" xmlns:v="urn:schemas-microsoft-com:vml" xmlns:wp14="http://schemas.microsoft.com/office/word/2010/wordprocessingDrawing" xmlns:wp="http://schemas.openxmlformats.org/drawingml/2006/wordprocessingDrawing" xmlns:w10="urn:schemas-microsoft-com:office:word" xmlns:w="http://schemas.openxmlformats.org/wordprocessingml/2006/main" xmlns:w14="http://schemas.microsoft.com/office/word/2010/wordml" xmlns:w15="http://schemas.microsoft.com/office/word/2012/wordml" xmlns:w16cex="http://schemas.microsoft.com/office/word/2018/wordml/cex" xmlns:w16cid="http://schemas.microsoft.com/office/word/2016/wordml/cid" xmlns:w16="http://schemas.microsoft.com/office/word/2018/wordml" xmlns:w16du="http://schemas.microsoft.com/office/word/2023/wordml/word16du" xmlns:w16sdtdh="http://schemas.microsoft.com/office/word/2020/wordml/sdtdatahash" xmlns:w16sdtfl="http://schemas.microsoft.com/office/word/2024/wordml/sdtformatlock" xmlns:w16se="http://schemas.microsoft.com/office/word/2015/wordml/symex" xmlns:wpg="http://schemas.microsoft.com/office/word/2010/wordprocessingGroup" xmlns:wpi="http://schemas.microsoft.com/office/word/2010/wordprocessingInk" xmlns:wne="http://schemas.microsoft.com/office/word/2006/wordml" xmlns:wps="http://schemas.microsoft.com/office/word/2010/wordprocessingShape" mc:Ignorable="w14 w15 w16se w16cid w16 w16cex w16sdtdh w16sdtfl w16du wp14">
   <w:endnote w:type="separator" w:id="-1">
     <w:p>
@@ -1281,7 +1332,40 @@
 </w:endnotes>
 </file>
 
-<file path=word/footnotes.xml><?xml version="1.0" encoding="utf-8"?>
+<file path=word\fontTable.xml><?xml version="1.0" encoding="utf-8"?>
+<w:fonts xmlns:mc="http://schemas.openxmlformats.org/markup-compatibility/2006" xmlns:r="http://schemas.openxmlformats.org/officeDocument/2006/relationships" xmlns:w="http://schemas.openxmlformats.org/wordprocessingml/2006/main" xmlns:w14="http://schemas.microsoft.com/office/word/2010/wordml" xmlns:w15="http://schemas.microsoft.com/office/word/2012/wordml" xmlns:w16cex="http://schemas.microsoft.com/office/word/2018/wordml/cex" xmlns:w16cid="http://schemas.microsoft.com/office/word/2016/wordml/cid" xmlns:w16="http://schemas.microsoft.com/office/word/2018/wordml" xmlns:w16du="http://schemas.microsoft.com/office/word/2023/wordml/word16du" xmlns:w16sdtdh="http://schemas.microsoft.com/office/word/2020/wordml/sdtdatahash" xmlns:w16sdtfl="http://schemas.microsoft.com/office/word/2024/wordml/sdtformatlock" xmlns:w16se="http://schemas.microsoft.com/office/word/2015/wordml/symex" mc:Ignorable="w14 w15 w16se w16cid w16 w16cex w16sdtdh w16sdtfl w16du">
+  <w:font w:name="Calibri">
+    <w:panose1 w:val="020F0502020204030204"/>
+    <w:charset w:val="00"/>
+    <w:family w:val="swiss"/>
+    <w:pitch w:val="variable"/>
+    <w:sig w:usb0="E4002EFF" w:usb1="C200247B" w:usb2="00000009" w:usb3="00000000" w:csb0="000001FF" w:csb1="00000000"/>
+  </w:font>
+  <w:font w:name="Times New Roman">
+    <w:panose1 w:val="02020603050405020304"/>
+    <w:charset w:val="00"/>
+    <w:family w:val="roman"/>
+    <w:pitch w:val="variable"/>
+    <w:sig w:usb0="E0002EFF" w:usb1="C000785B" w:usb2="00000009" w:usb3="00000000" w:csb0="000001FF" w:csb1="00000000"/>
+  </w:font>
+  <w:font w:name="Arial">
+    <w:panose1 w:val="020B0604020202020204"/>
+    <w:charset w:val="00"/>
+    <w:family w:val="swiss"/>
+    <w:pitch w:val="variable"/>
+    <w:sig w:usb0="E0002EFF" w:usb1="C000785B" w:usb2="00000009" w:usb3="00000000" w:csb0="000001FF" w:csb1="00000000"/>
+  </w:font>
+  <w:font w:name="Cambria">
+    <w:panose1 w:val="02040503050406030204"/>
+    <w:charset w:val="00"/>
+    <w:family w:val="roman"/>
+    <w:pitch w:val="variable"/>
+    <w:sig w:usb0="E00006FF" w:usb1="420024FF" w:usb2="02000000" w:usb3="00000000" w:csb0="0000019F" w:csb1="00000000"/>
+  </w:font>
+</w:fonts>
+</file>
+
+<file path=word\footnotes.xml><?xml version="1.0" encoding="utf-8"?>
 <w:footnotes xmlns:wpc="http://schemas.microsoft.com/office/word/2010/wordprocessingCanvas" xmlns:cx="http://schemas.microsoft.com/office/drawing/2014/chartex" xmlns:cx1="http://schemas.microsoft.com/office/drawing/2015/9/8/chartex" xmlns:cx2="http://schemas.microsoft.com/office/drawing/2015/10/21/chartex" xmlns:cx3="http://schemas.microsoft.com/office/drawing/2016/5/9/chartex" xmlns:cx4="http://schemas.microsoft.com/office/drawing/2016/5/10/chartex" xmlns:cx5="http://schemas.microsoft.com/office/drawing/2016/5/11/chartex" xmlns:cx6="http://schemas.microsoft.com/office/drawing/2016/5/12/chartex" xmlns:cx7="http://schemas.microsoft.com/office/drawing/2016/5/13/chartex" xmlns:cx8="http://schemas.microsoft.com/office/drawing/2016/5/14/chartex" xmlns:mc="http://schemas.openxmlformats.org/markup-compatibility/2006" xmlns:aink="http://schemas.microsoft.com/office/drawing/2016/ink" xmlns:am3d="http://schemas.microsoft.com/office/drawing/2017/model3d" xmlns:o="urn:schemas-microsoft-com:office:office" xmlns:oel="http://schemas.microsoft.com/office/2019/extlst" xmlns:r="http://schemas.openxmlformats.org/officeDocument/2006/relationships" xmlns:m="http://schemas.openxmlformats.org/officeDocument/2006/math" xmlns:v="urn:schemas-microsoft-com:vml" xmlns:wp14="http://schemas.microsoft.com/office/word/2010/wordprocessingDrawing" xmlns:wp="http://schemas.openxmlformats.org/drawingml/2006/wordprocessingDrawing" xmlns:w10="urn:schemas-microsoft-com:office:word" xmlns:w="http://schemas.openxmlformats.org/wordprocessingml/2006/main" xmlns:w14="http://schemas.microsoft.com/office/word/2010/wordml" xmlns:w15="http://schemas.microsoft.com/office/word/2012/wordml" xmlns:w16cex="http://schemas.microsoft.com/office/word/2018/wordml/cex" xmlns:w16cid="http://schemas.microsoft.com/office/word/2016/wordml/cid" xmlns:w16="http://schemas.microsoft.com/office/word/2018/wordml" xmlns:w16du="http://schemas.microsoft.com/office/word/2023/wordml/word16du" xmlns:w16sdtdh="http://schemas.microsoft.com/office/word/2020/wordml/sdtdatahash" xmlns:w16sdtfl="http://schemas.microsoft.com/office/word/2024/wordml/sdtformatlock" xmlns:w16se="http://schemas.microsoft.com/office/word/2015/wordml/symex" xmlns:wpg="http://schemas.microsoft.com/office/word/2010/wordprocessingGroup" xmlns:wpi="http://schemas.microsoft.com/office/word/2010/wordprocessingInk" xmlns:wne="http://schemas.microsoft.com/office/word/2006/wordml" xmlns:wps="http://schemas.microsoft.com/office/word/2010/wordprocessingShape" mc:Ignorable="w14 w15 w16se w16cid w16 w16cex w16sdtdh w16sdtfl w16du wp14">
   <w:footnote w:type="separator" w:id="-1">
     <w:p>
@@ -1306,7 +1390,7 @@
 </w:footnotes>
 </file>
 
-<file path=word/header1.xml><?xml version="1.0" encoding="utf-8"?>
+<file path=word\header1.xml><?xml version="1.0" encoding="utf-8"?>
 <w:hdr xmlns:wpc="http://schemas.microsoft.com/office/word/2010/wordprocessingCanvas" xmlns:cx="http://schemas.microsoft.com/office/drawing/2014/chartex" xmlns:cx1="http://schemas.microsoft.com/office/drawing/2015/9/8/chartex" xmlns:cx2="http://schemas.microsoft.com/office/drawing/2015/10/21/chartex" xmlns:cx3="http://schemas.microsoft.com/office/drawing/2016/5/9/chartex" xmlns:cx4="http://schemas.microsoft.com/office/drawing/2016/5/10/chartex" xmlns:cx5="http://schemas.microsoft.com/office/drawing/2016/5/11/chartex" xmlns:cx6="http://schemas.microsoft.com/office/drawing/2016/5/12/chartex" xmlns:cx7="http://schemas.microsoft.com/office/drawing/2016/5/13/chartex" xmlns:cx8="http://schemas.microsoft.com/office/drawing/2016/5/14/chartex" xmlns:mc="http://schemas.openxmlformats.org/markup-compatibility/2006" xmlns:aink="http://schemas.microsoft.com/office/drawing/2016/ink" xmlns:am3d="http://schemas.microsoft.com/office/drawing/2017/model3d" xmlns:o="urn:schemas-microsoft-com:office:office" xmlns:oel="http://schemas.microsoft.com/office/2019/extlst" xmlns:r="http://schemas.openxmlformats.org/officeDocument/2006/relationships" xmlns:m="http://schemas.openxmlformats.org/officeDocument/2006/math" xmlns:v="urn:schemas-microsoft-com:vml" xmlns:wp14="http://schemas.microsoft.com/office/word/2010/wordprocessingDrawing" xmlns:wp="http://schemas.openxmlformats.org/drawingml/2006/wordprocessingDrawing" xmlns:w10="urn:schemas-microsoft-com:office:word" xmlns:w="http://schemas.openxmlformats.org/wordprocessingml/2006/main" xmlns:w14="http://schemas.microsoft.com/office/word/2010/wordml" xmlns:w15="http://schemas.microsoft.com/office/word/2012/wordml" xmlns:w16cex="http://schemas.microsoft.com/office/word/2018/wordml/cex" xmlns:w16cid="http://schemas.microsoft.com/office/word/2016/wordml/cid" xmlns:w16="http://schemas.microsoft.com/office/word/2018/wordml" xmlns:w16du="http://schemas.microsoft.com/office/word/2023/wordml/word16du" xmlns:w16sdtdh="http://schemas.microsoft.com/office/word/2020/wordml/sdtdatahash" xmlns:w16sdtfl="http://schemas.microsoft.com/office/word/2024/wordml/sdtformatlock" xmlns:w16se="http://schemas.microsoft.com/office/word/2015/wordml/symex" xmlns:wpg="http://schemas.microsoft.com/office/word/2010/wordprocessingGroup" xmlns:wpi="http://schemas.microsoft.com/office/word/2010/wordprocessingInk" xmlns:wne="http://schemas.microsoft.com/office/word/2006/wordml" xmlns:wps="http://schemas.microsoft.com/office/word/2010/wordprocessingShape" mc:Ignorable="w14 w15 w16se w16cid w16 w16cex w16sdtdh w16sdtfl w16du wp14">
   <w:p>
     <w:pPr>
@@ -1376,7 +1460,7 @@
 </w:hdr>
 </file>
 
-<file path=word/numbering.xml><?xml version="1.0" encoding="utf-8"?>
+<file path=word\numbering.xml><?xml version="1.0" encoding="utf-8"?>
 <w:numbering xmlns:wpc="http://schemas.microsoft.com/office/word/2010/wordprocessingCanvas" xmlns:cx="http://schemas.microsoft.com/office/drawing/2014/chartex" xmlns:cx1="http://schemas.microsoft.com/office/drawing/2015/9/8/chartex" xmlns:cx2="http://schemas.microsoft.com/office/drawing/2015/10/21/chartex" xmlns:cx3="http://schemas.microsoft.com/office/drawing/2016/5/9/chartex" xmlns:cx4="http://schemas.microsoft.com/office/drawing/2016/5/10/chartex" xmlns:cx5="http://schemas.microsoft.com/office/drawing/2016/5/11/chartex" xmlns:cx6="http://schemas.microsoft.com/office/drawing/2016/5/12/chartex" xmlns:cx7="http://schemas.microsoft.com/office/drawing/2016/5/13/chartex" xmlns:cx8="http://schemas.microsoft.com/office/drawing/2016/5/14/chartex" xmlns:mc="http://schemas.openxmlformats.org/markup-compatibility/2006" xmlns:aink="http://schemas.microsoft.com/office/drawing/2016/ink" xmlns:am3d="http://schemas.microsoft.com/office/drawing/2017/model3d" xmlns:o="urn:schemas-microsoft-com:office:office" xmlns:oel="http://schemas.microsoft.com/office/2019/extlst" xmlns:r="http://schemas.openxmlformats.org/officeDocument/2006/relationships" xmlns:m="http://schemas.openxmlformats.org/officeDocument/2006/math" xmlns:v="urn:schemas-microsoft-com:vml" xmlns:wp14="http://schemas.microsoft.com/office/word/2010/wordprocessingDrawing" xmlns:wp="http://schemas.openxmlformats.org/drawingml/2006/wordprocessingDrawing" xmlns:w10="urn:schemas-microsoft-com:office:word" xmlns:w="http://schemas.openxmlformats.org/wordprocessingml/2006/main" xmlns:w14="http://schemas.microsoft.com/office/word/2010/wordml" xmlns:w15="http://schemas.microsoft.com/office/word/2012/wordml" xmlns:w16cex="http://schemas.microsoft.com/office/word/2018/wordml/cex" xmlns:w16cid="http://schemas.microsoft.com/office/word/2016/wordml/cid" xmlns:w16="http://schemas.microsoft.com/office/word/2018/wordml" xmlns:w16du="http://schemas.microsoft.com/office/word/2023/wordml/word16du" xmlns:w16sdtdh="http://schemas.microsoft.com/office/word/2020/wordml/sdtdatahash" xmlns:w16sdtfl="http://schemas.microsoft.com/office/word/2024/wordml/sdtformatlock" xmlns:w16se="http://schemas.microsoft.com/office/word/2015/wordml/symex" xmlns:wpg="http://schemas.microsoft.com/office/word/2010/wordprocessingGroup" xmlns:wpi="http://schemas.microsoft.com/office/word/2010/wordprocessingInk" xmlns:wne="http://schemas.microsoft.com/office/word/2006/wordml" xmlns:wps="http://schemas.microsoft.com/office/word/2010/wordprocessingShape" mc:Ignorable="w14 w15 w16se w16cid w16 w16cex w16sdtdh w16sdtfl w16du wp14">
   <w:abstractNum w:abstractNumId="0" w15:restartNumberingAfterBreak="0">
     <w:nsid w:val="689E407D"/>
@@ -1470,7 +1554,163 @@
 </w:numbering>
 </file>
 
-<file path=word/styles.xml><?xml version="1.0" encoding="utf-8"?>
+<file path=word\settings.xml><?xml version="1.0" encoding="utf-8"?>
+<w:settings xmlns:mc="http://schemas.openxmlformats.org/markup-compatibility/2006" xmlns:o="urn:schemas-microsoft-com:office:office" xmlns:r="http://schemas.openxmlformats.org/officeDocument/2006/relationships" xmlns:m="http://schemas.openxmlformats.org/officeDocument/2006/math" xmlns:v="urn:schemas-microsoft-com:vml" xmlns:w10="urn:schemas-microsoft-com:office:word" xmlns:w="http://schemas.openxmlformats.org/wordprocessingml/2006/main" xmlns:w14="http://schemas.microsoft.com/office/word/2010/wordml" xmlns:w15="http://schemas.microsoft.com/office/word/2012/wordml" xmlns:w16cex="http://schemas.microsoft.com/office/word/2018/wordml/cex" xmlns:w16cid="http://schemas.microsoft.com/office/word/2016/wordml/cid" xmlns:w16="http://schemas.microsoft.com/office/word/2018/wordml" xmlns:w16du="http://schemas.microsoft.com/office/word/2023/wordml/word16du" xmlns:w16sdtdh="http://schemas.microsoft.com/office/word/2020/wordml/sdtdatahash" xmlns:w16sdtfl="http://schemas.microsoft.com/office/word/2024/wordml/sdtformatlock" xmlns:w16se="http://schemas.microsoft.com/office/word/2015/wordml/symex" xmlns:sl="http://schemas.openxmlformats.org/schemaLibrary/2006/main" mc:Ignorable="w14 w15 w16se w16cid w16 w16cex w16sdtdh w16sdtfl w16du">
+  <w:zoom w:percent="100"/>
+  <w:defaultTabStop w:val="720"/>
+  <w:characterSpacingControl w:val="doNotCompress"/>
+  <w:hdrShapeDefaults>
+    <o:shapedefaults v:ext="edit" spidmax="2050"/>
+  </w:hdrShapeDefaults>
+  <w:footnotePr>
+    <w:footnote w:id="-1"/>
+    <w:footnote w:id="0"/>
+  </w:footnotePr>
+  <w:endnotePr>
+    <w:endnote w:id="-1"/>
+    <w:endnote w:id="0"/>
+  </w:endnotePr>
+  <w:compat>
+    <w:compatSetting w:name="compatibilityMode" w:uri="http://schemas.microsoft.com/office/word" w:val="15"/>
+    <w:compatSetting w:name="overrideTableStyleFontSizeAndJustification" w:uri="http://schemas.microsoft.com/office/word" w:val="1"/>
+    <w:compatSetting w:name="enableOpenTypeFeatures" w:uri="http://schemas.microsoft.com/office/word" w:val="1"/>
+    <w:compatSetting w:name="doNotFlipMirrorIndents" w:uri="http://schemas.microsoft.com/office/word" w:val="1"/>
+    <w:compatSetting w:name="differentiateMultirowTableHeaders" w:uri="http://schemas.microsoft.com/office/word" w:val="1"/>
+    <w:compatSetting w:name="useWord2013TrackBottomHyphenation" w:uri="http://schemas.microsoft.com/office/word" w:val="0"/>
+  </w:compat>
+  <w:rsids>
+    <w:rsidRoot w:val="00DD5A9F"/>
+    <w:rsid w:val="000359A7"/>
+    <w:rsid w:val="00045976"/>
+    <w:rsid w:val="00090DDD"/>
+    <w:rsid w:val="000A3428"/>
+    <w:rsid w:val="000D459D"/>
+    <w:rsid w:val="001324DE"/>
+    <w:rsid w:val="001407EA"/>
+    <w:rsid w:val="0015364A"/>
+    <w:rsid w:val="0018053B"/>
+    <w:rsid w:val="001C3147"/>
+    <w:rsid w:val="001F0993"/>
+    <w:rsid w:val="001F403E"/>
+    <w:rsid w:val="0020386E"/>
+    <w:rsid w:val="00291058"/>
+    <w:rsid w:val="002D65E4"/>
+    <w:rsid w:val="002E508A"/>
+    <w:rsid w:val="00302823"/>
+    <w:rsid w:val="00304C7C"/>
+    <w:rsid w:val="00326693"/>
+    <w:rsid w:val="003301A9"/>
+    <w:rsid w:val="00333E4C"/>
+    <w:rsid w:val="00404D61"/>
+    <w:rsid w:val="0041277C"/>
+    <w:rsid w:val="004816B5"/>
+    <w:rsid w:val="004A2808"/>
+    <w:rsid w:val="004D0423"/>
+    <w:rsid w:val="004D1209"/>
+    <w:rsid w:val="00516EC9"/>
+    <w:rsid w:val="00545008"/>
+    <w:rsid w:val="00555868"/>
+    <w:rsid w:val="00556403"/>
+    <w:rsid w:val="00587FE1"/>
+    <w:rsid w:val="005A2678"/>
+    <w:rsid w:val="00621837"/>
+    <w:rsid w:val="006670BB"/>
+    <w:rsid w:val="0067234A"/>
+    <w:rsid w:val="006B7361"/>
+    <w:rsid w:val="006D2334"/>
+    <w:rsid w:val="006D2EFC"/>
+    <w:rsid w:val="006D2F50"/>
+    <w:rsid w:val="006F4F17"/>
+    <w:rsid w:val="006F5BD3"/>
+    <w:rsid w:val="00736E9C"/>
+    <w:rsid w:val="007568AA"/>
+    <w:rsid w:val="0077611C"/>
+    <w:rsid w:val="00785DA3"/>
+    <w:rsid w:val="007A6F0C"/>
+    <w:rsid w:val="008303D1"/>
+    <w:rsid w:val="008305BB"/>
+    <w:rsid w:val="00867D72"/>
+    <w:rsid w:val="008C3751"/>
+    <w:rsid w:val="008C76B4"/>
+    <w:rsid w:val="008E2544"/>
+    <w:rsid w:val="0095091A"/>
+    <w:rsid w:val="00952D8A"/>
+    <w:rsid w:val="009A0CA4"/>
+    <w:rsid w:val="009B0AD5"/>
+    <w:rsid w:val="009B6AF4"/>
+    <w:rsid w:val="009D1DC5"/>
+    <w:rsid w:val="009D2012"/>
+    <w:rsid w:val="009D2CF8"/>
+    <w:rsid w:val="00A01917"/>
+    <w:rsid w:val="00A10B9E"/>
+    <w:rsid w:val="00A54669"/>
+    <w:rsid w:val="00A63068"/>
+    <w:rsid w:val="00AB7C81"/>
+    <w:rsid w:val="00AF5E2C"/>
+    <w:rsid w:val="00B039FE"/>
+    <w:rsid w:val="00B32408"/>
+    <w:rsid w:val="00B45305"/>
+    <w:rsid w:val="00B82C1A"/>
+    <w:rsid w:val="00B83F05"/>
+    <w:rsid w:val="00BA6678"/>
+    <w:rsid w:val="00BF433B"/>
+    <w:rsid w:val="00C102A3"/>
+    <w:rsid w:val="00C437E2"/>
+    <w:rsid w:val="00C57A0C"/>
+    <w:rsid w:val="00C82635"/>
+    <w:rsid w:val="00CB5A74"/>
+    <w:rsid w:val="00CB7968"/>
+    <w:rsid w:val="00CD74DE"/>
+    <w:rsid w:val="00CF1847"/>
+    <w:rsid w:val="00D26FE0"/>
+    <w:rsid w:val="00D27DEF"/>
+    <w:rsid w:val="00D37ACF"/>
+    <w:rsid w:val="00D6069A"/>
+    <w:rsid w:val="00D67067"/>
+    <w:rsid w:val="00D8320D"/>
+    <w:rsid w:val="00D957C0"/>
+    <w:rsid w:val="00DA64EF"/>
+    <w:rsid w:val="00DD5A9F"/>
+    <w:rsid w:val="00E04D7A"/>
+    <w:rsid w:val="00E411B7"/>
+    <w:rsid w:val="00E47D5A"/>
+    <w:rsid w:val="00EA4F25"/>
+    <w:rsid w:val="00EB3692"/>
+    <w:rsid w:val="00EE16BF"/>
+    <w:rsid w:val="00F1784D"/>
+    <w:rsid w:val="00F947D3"/>
+    <w:rsid w:val="00F97076"/>
+    <w:rsid w:val="00FE4A3E"/>
+  </w:rsids>
+  <m:mathPr>
+    <m:mathFont m:val="Cambria Math"/>
+    <m:brkBin m:val="before"/>
+    <m:brkBinSub m:val="--"/>
+    <m:smallFrac m:val="0"/>
+    <m:dispDef/>
+    <m:lMargin m:val="0"/>
+    <m:rMargin m:val="0"/>
+    <m:defJc m:val="centerGroup"/>
+    <m:wrapIndent m:val="1440"/>
+    <m:intLim m:val="subSup"/>
+    <m:naryLim m:val="undOvr"/>
+  </m:mathPr>
+  <w:themeFontLang w:val="en-US"/>
+  <w:clrSchemeMapping w:bg1="light1" w:t1="dark1" w:bg2="light2" w:t2="dark2" w:accent1="accent1" w:accent2="accent2" w:accent3="accent3" w:accent4="accent4" w:accent5="accent5" w:accent6="accent6" w:hyperlink="hyperlink" w:followedHyperlink="followedHyperlink"/>
+  <w:shapeDefaults>
+    <o:shapedefaults v:ext="edit" spidmax="2050"/>
+    <o:shapelayout v:ext="edit">
+      <o:idmap v:ext="edit" data="2"/>
+    </o:shapelayout>
+  </w:shapeDefaults>
+  <w:decimalSymbol w:val=","/>
+  <w:listSeparator w:val=";"/>
+  <w14:docId w14:val="042CEE11"/>
+  <w15:docId w15:val="{2F0EB663-7E86-4BC2-922A-CB72D874DD46}"/>
+</w:settings>
+</file>
+
+<file path=word\styles.xml><?xml version="1.0" encoding="utf-8"?>
 <w:styles xmlns:mc="http://schemas.openxmlformats.org/markup-compatibility/2006" xmlns:r="http://schemas.openxmlformats.org/officeDocument/2006/relationships" xmlns:w="http://schemas.openxmlformats.org/wordprocessingml/2006/main" xmlns:w14="http://schemas.microsoft.com/office/word/2010/wordml" xmlns:w15="http://schemas.microsoft.com/office/word/2012/wordml" xmlns:w16cex="http://schemas.microsoft.com/office/word/2018/wordml/cex" xmlns:w16cid="http://schemas.microsoft.com/office/word/2016/wordml/cid" xmlns:w16="http://schemas.microsoft.com/office/word/2018/wordml" xmlns:w16du="http://schemas.microsoft.com/office/word/2023/wordml/word16du" xmlns:w16sdtdh="http://schemas.microsoft.com/office/word/2020/wordml/sdtdatahash" xmlns:w16sdtfl="http://schemas.microsoft.com/office/word/2024/wordml/sdtformatlock" xmlns:w16se="http://schemas.microsoft.com/office/word/2015/wordml/symex" mc:Ignorable="w14 w15 w16se w16cid w16 w16cex w16sdtdh w16sdtfl w16du">
   <w:docDefaults>
     <w:rPrDefault>
@@ -1996,7 +2236,7 @@
 </w:styles>
 </file>
 
-<file path=word/theme/theme1.xml><?xml version="1.0" encoding="utf-8"?>
+<file path=word\theme\theme1.xml><?xml version="1.0" encoding="utf-8"?>
 <a:theme xmlns:a="http://schemas.openxmlformats.org/drawingml/2006/main" name="Office Theme">
   <a:themeElements>
     <a:clrScheme name="Office">
@@ -2279,4 +2519,12 @@
   <a:objectDefaults/>
   <a:extraClrSchemeLst/>
 </a:theme>
+</file>
+
+<file path=word\webSettings.xml><?xml version="1.0" encoding="utf-8"?>
+<w:webSettings xmlns:mc="http://schemas.openxmlformats.org/markup-compatibility/2006" xmlns:r="http://schemas.openxmlformats.org/officeDocument/2006/relationships" xmlns:w="http://schemas.openxmlformats.org/wordprocessingml/2006/main" xmlns:w14="http://schemas.microsoft.com/office/word/2010/wordml" xmlns:w15="http://schemas.microsoft.com/office/word/2012/wordml" xmlns:w16cex="http://schemas.microsoft.com/office/word/2018/wordml/cex" xmlns:w16cid="http://schemas.microsoft.com/office/word/2016/wordml/cid" xmlns:w16="http://schemas.microsoft.com/office/word/2018/wordml" xmlns:w16du="http://schemas.microsoft.com/office/word/2023/wordml/word16du" xmlns:w16sdtdh="http://schemas.microsoft.com/office/word/2020/wordml/sdtdatahash" xmlns:w16sdtfl="http://schemas.microsoft.com/office/word/2024/wordml/sdtformatlock" xmlns:w16se="http://schemas.microsoft.com/office/word/2015/wordml/symex" mc:Ignorable="w14 w15 w16se w16cid w16 w16cex w16sdtdh w16sdtfl w16du">
+  <w:optimizeForBrowser/>
+  <w:relyOnVML/>
+  <w:allowPNG/>
+</w:webSettings>
 </file>
</xml_diff>

<commit_message>
fix: pastikan zip entry path menggunakan forward slash agar data template dispensasi terisi sempurna
</commit_message>
<xml_diff>
--- a/public/dispensasi.docx
+++ b/public/dispensasi.docx
@@ -1,56 +1,5 @@
 
-<file path=docProps\app.xml><?xml version="1.0" encoding="utf-8"?>
-<Properties xmlns="http://schemas.openxmlformats.org/officeDocument/2006/extended-properties" xmlns:vt="http://schemas.openxmlformats.org/officeDocument/2006/docPropsVTypes">
-  <Template>Normal.dotm</Template>
-  <TotalTime>114</TotalTime>
-  <Pages>1</Pages>
-  <Words>126</Words>
-  <Characters>719</Characters>
-  <Application>Microsoft Office Word</Application>
-  <DocSecurity>0</DocSecurity>
-  <Lines>5</Lines>
-  <Paragraphs>1</Paragraphs>
-  <ScaleCrop>false</ScaleCrop>
-  <HeadingPairs>
-    <vt:vector size="2" baseType="variant">
-      <vt:variant>
-        <vt:lpstr>Title</vt:lpstr>
-      </vt:variant>
-      <vt:variant>
-        <vt:i4>1</vt:i4>
-      </vt:variant>
-    </vt:vector>
-  </HeadingPairs>
-  <TitlesOfParts>
-    <vt:vector size="1" baseType="lpstr">
-      <vt:lpstr/>
-    </vt:vector>
-  </TitlesOfParts>
-  <Company/>
-  <LinksUpToDate>false</LinksUpToDate>
-  <CharactersWithSpaces>844</CharactersWithSpaces>
-  <SharedDoc>false</SharedDoc>
-  <HyperlinksChanged>false</HyperlinksChanged>
-  <AppVersion>16.0000</AppVersion>
-</Properties>
-</file>
-
-<file path=docProps\core.xml><?xml version="1.0" encoding="utf-8"?>
-<cp:coreProperties xmlns:cp="http://schemas.openxmlformats.org/package/2006/metadata/core-properties" xmlns:dc="http://purl.org/dc/elements/1.1/" xmlns:dcterms="http://purl.org/dc/terms/" xmlns:dcmitype="http://purl.org/dc/dcmitype/" xmlns:xsi="http://www.w3.org/2001/XMLSchema-instance">
-  <dc:title/>
-  <dc:subject/>
-  <dc:creator>Informasi</dc:creator>
-  <cp:keywords/>
-  <dc:description/>
-  <cp:lastModifiedBy>user</cp:lastModifiedBy>
-  <cp:revision>7</cp:revision>
-  <cp:lastPrinted>2026-07-24T04:38:00Z</cp:lastPrinted>
-  <dcterms:created xsi:type="dcterms:W3CDTF">2026-08-07T00:54:00Z</dcterms:created>
-  <dcterms:modified xsi:type="dcterms:W3CDTF">2026-08-07T05:44:00Z</dcterms:modified>
-</cp:coreProperties>
-</file>
-
-<file path=word\document.xml><?xml version="1.0" encoding="utf-8"?>
+<file path=word/document.xml><?xml version="1.0" encoding="utf-8"?>
 <w:document xmlns:wpc="http://schemas.microsoft.com/office/word/2010/wordprocessingCanvas" xmlns:cx="http://schemas.microsoft.com/office/drawing/2014/chartex" xmlns:cx1="http://schemas.microsoft.com/office/drawing/2015/9/8/chartex" xmlns:cx2="http://schemas.microsoft.com/office/drawing/2015/10/21/chartex" xmlns:cx3="http://schemas.microsoft.com/office/drawing/2016/5/9/chartex" xmlns:cx4="http://schemas.microsoft.com/office/drawing/2016/5/10/chartex" xmlns:cx5="http://schemas.microsoft.com/office/drawing/2016/5/11/chartex" xmlns:cx6="http://schemas.microsoft.com/office/drawing/2016/5/12/chartex" xmlns:cx7="http://schemas.microsoft.com/office/drawing/2016/5/13/chartex" xmlns:cx8="http://schemas.microsoft.com/office/drawing/2016/5/14/chartex" xmlns:mc="http://schemas.openxmlformats.org/markup-compatibility/2006" xmlns:aink="http://schemas.microsoft.com/office/drawing/2016/ink" xmlns:am3d="http://schemas.microsoft.com/office/drawing/2017/model3d" xmlns:o="urn:schemas-microsoft-com:office:office" xmlns:oel="http://schemas.microsoft.com/office/2019/extlst" xmlns:r="http://schemas.openxmlformats.org/officeDocument/2006/relationships" xmlns:m="http://schemas.openxmlformats.org/officeDocument/2006/math" xmlns:v="urn:schemas-microsoft-com:vml" xmlns:wp14="http://schemas.microsoft.com/office/word/2010/wordprocessingDrawing" xmlns:wp="http://schemas.openxmlformats.org/drawingml/2006/wordprocessingDrawing" xmlns:w10="urn:schemas-microsoft-com:office:word" xmlns:w="http://schemas.openxmlformats.org/wordprocessingml/2006/main" xmlns:w14="http://schemas.microsoft.com/office/word/2010/wordml" xmlns:w15="http://schemas.microsoft.com/office/word/2012/wordml" xmlns:w16cex="http://schemas.microsoft.com/office/word/2018/wordml/cex" xmlns:w16cid="http://schemas.microsoft.com/office/word/2016/wordml/cid" xmlns:w16="http://schemas.microsoft.com/office/word/2018/wordml" xmlns:w16du="http://schemas.microsoft.com/office/word/2023/wordml/word16du" xmlns:w16sdtdh="http://schemas.microsoft.com/office/word/2020/wordml/sdtdatahash" xmlns:w16sdtfl="http://schemas.microsoft.com/office/word/2024/wordml/sdtformatlock" xmlns:w16se="http://schemas.microsoft.com/office/word/2015/wordml/symex" xmlns:wpg="http://schemas.microsoft.com/office/word/2010/wordprocessingGroup" xmlns:wpi="http://schemas.microsoft.com/office/word/2010/wordprocessingInk" xmlns:wne="http://schemas.microsoft.com/office/word/2006/wordml" xmlns:wps="http://schemas.microsoft.com/office/word/2010/wordprocessingShape" mc:Ignorable="w14 w15 w16se w16cid w16 w16cex w16sdtdh w16sdtfl w16du wp14">
   <w:body>
     <w:p>
@@ -1307,7 +1256,7 @@
 </w:document>
 </file>
 
-<file path=word\endnotes.xml><?xml version="1.0" encoding="utf-8"?>
+<file path=word/endnotes.xml><?xml version="1.0" encoding="utf-8"?>
 <w:endnotes xmlns:wpc="http://schemas.microsoft.com/office/word/2010/wordprocessingCanvas" xmlns:cx="http://schemas.microsoft.com/office/drawing/2014/chartex" xmlns:cx1="http://schemas.microsoft.com/office/drawing/2015/9/8/chartex" xmlns:cx2="http://schemas.microsoft.com/office/drawing/2015/10/21/chartex" xmlns:cx3="http://schemas.microsoft.com/office/drawing/2016/5/9/chartex" xmlns:cx4="http://schemas.microsoft.com/office/drawing/2016/5/10/chartex" xmlns:cx5="http://schemas.microsoft.com/office/drawing/2016/5/11/chartex" xmlns:cx6="http://schemas.microsoft.com/office/drawing/2016/5/12/chartex" xmlns:cx7="http://schemas.microsoft.com/office/drawing/2016/5/13/chartex" xmlns:cx8="http://schemas.microsoft.com/office/drawing/2016/5/14/chartex" xmlns:mc="http://schemas.openxmlformats.org/markup-compatibility/2006" xmlns:aink="http://schemas.microsoft.com/office/drawing/2016/ink" xmlns:am3d="http://schemas.microsoft.com/office/drawing/2017/model3d" xmlns:o="urn:schemas-microsoft-com:office:office" xmlns:oel="http://schemas.microsoft.com/office/2019/extlst" xmlns:r="http://schemas.openxmlformats.org/officeDocument/2006/relationships" xmlns:m="http://schemas.openxmlformats.org/officeDocument/2006/math" xmlns:v="urn:schemas-microsoft-com:vml" xmlns:wp14="http://schemas.microsoft.com/office/word/2010/wordprocessingDrawing" xmlns:wp="http://schemas.openxmlformats.org/drawingml/2006/wordprocessingDrawing" xmlns:w10="urn:schemas-microsoft-com:office:word" xmlns:w="http://schemas.openxmlformats.org/wordprocessingml/2006/main" xmlns:w14="http://schemas.microsoft.com/office/word/2010/wordml" xmlns:w15="http://schemas.microsoft.com/office/word/2012/wordml" xmlns:w16cex="http://schemas.microsoft.com/office/word/2018/wordml/cex" xmlns:w16cid="http://schemas.microsoft.com/office/word/2016/wordml/cid" xmlns:w16="http://schemas.microsoft.com/office/word/2018/wordml" xmlns:w16du="http://schemas.microsoft.com/office/word/2023/wordml/word16du" xmlns:w16sdtdh="http://schemas.microsoft.com/office/word/2020/wordml/sdtdatahash" xmlns:w16sdtfl="http://schemas.microsoft.com/office/word/2024/wordml/sdtformatlock" xmlns:w16se="http://schemas.microsoft.com/office/word/2015/wordml/symex" xmlns:wpg="http://schemas.microsoft.com/office/word/2010/wordprocessingGroup" xmlns:wpi="http://schemas.microsoft.com/office/word/2010/wordprocessingInk" xmlns:wne="http://schemas.microsoft.com/office/word/2006/wordml" xmlns:wps="http://schemas.microsoft.com/office/word/2010/wordprocessingShape" mc:Ignorable="w14 w15 w16se w16cid w16 w16cex w16sdtdh w16sdtfl w16du wp14">
   <w:endnote w:type="separator" w:id="-1">
     <w:p>
@@ -1332,40 +1281,7 @@
 </w:endnotes>
 </file>
 
-<file path=word\fontTable.xml><?xml version="1.0" encoding="utf-8"?>
-<w:fonts xmlns:mc="http://schemas.openxmlformats.org/markup-compatibility/2006" xmlns:r="http://schemas.openxmlformats.org/officeDocument/2006/relationships" xmlns:w="http://schemas.openxmlformats.org/wordprocessingml/2006/main" xmlns:w14="http://schemas.microsoft.com/office/word/2010/wordml" xmlns:w15="http://schemas.microsoft.com/office/word/2012/wordml" xmlns:w16cex="http://schemas.microsoft.com/office/word/2018/wordml/cex" xmlns:w16cid="http://schemas.microsoft.com/office/word/2016/wordml/cid" xmlns:w16="http://schemas.microsoft.com/office/word/2018/wordml" xmlns:w16du="http://schemas.microsoft.com/office/word/2023/wordml/word16du" xmlns:w16sdtdh="http://schemas.microsoft.com/office/word/2020/wordml/sdtdatahash" xmlns:w16sdtfl="http://schemas.microsoft.com/office/word/2024/wordml/sdtformatlock" xmlns:w16se="http://schemas.microsoft.com/office/word/2015/wordml/symex" mc:Ignorable="w14 w15 w16se w16cid w16 w16cex w16sdtdh w16sdtfl w16du">
-  <w:font w:name="Calibri">
-    <w:panose1 w:val="020F0502020204030204"/>
-    <w:charset w:val="00"/>
-    <w:family w:val="swiss"/>
-    <w:pitch w:val="variable"/>
-    <w:sig w:usb0="E4002EFF" w:usb1="C200247B" w:usb2="00000009" w:usb3="00000000" w:csb0="000001FF" w:csb1="00000000"/>
-  </w:font>
-  <w:font w:name="Times New Roman">
-    <w:panose1 w:val="02020603050405020304"/>
-    <w:charset w:val="00"/>
-    <w:family w:val="roman"/>
-    <w:pitch w:val="variable"/>
-    <w:sig w:usb0="E0002EFF" w:usb1="C000785B" w:usb2="00000009" w:usb3="00000000" w:csb0="000001FF" w:csb1="00000000"/>
-  </w:font>
-  <w:font w:name="Arial">
-    <w:panose1 w:val="020B0604020202020204"/>
-    <w:charset w:val="00"/>
-    <w:family w:val="swiss"/>
-    <w:pitch w:val="variable"/>
-    <w:sig w:usb0="E0002EFF" w:usb1="C000785B" w:usb2="00000009" w:usb3="00000000" w:csb0="000001FF" w:csb1="00000000"/>
-  </w:font>
-  <w:font w:name="Cambria">
-    <w:panose1 w:val="02040503050406030204"/>
-    <w:charset w:val="00"/>
-    <w:family w:val="roman"/>
-    <w:pitch w:val="variable"/>
-    <w:sig w:usb0="E00006FF" w:usb1="420024FF" w:usb2="02000000" w:usb3="00000000" w:csb0="0000019F" w:csb1="00000000"/>
-  </w:font>
-</w:fonts>
-</file>
-
-<file path=word\footnotes.xml><?xml version="1.0" encoding="utf-8"?>
+<file path=word/footnotes.xml><?xml version="1.0" encoding="utf-8"?>
 <w:footnotes xmlns:wpc="http://schemas.microsoft.com/office/word/2010/wordprocessingCanvas" xmlns:cx="http://schemas.microsoft.com/office/drawing/2014/chartex" xmlns:cx1="http://schemas.microsoft.com/office/drawing/2015/9/8/chartex" xmlns:cx2="http://schemas.microsoft.com/office/drawing/2015/10/21/chartex" xmlns:cx3="http://schemas.microsoft.com/office/drawing/2016/5/9/chartex" xmlns:cx4="http://schemas.microsoft.com/office/drawing/2016/5/10/chartex" xmlns:cx5="http://schemas.microsoft.com/office/drawing/2016/5/11/chartex" xmlns:cx6="http://schemas.microsoft.com/office/drawing/2016/5/12/chartex" xmlns:cx7="http://schemas.microsoft.com/office/drawing/2016/5/13/chartex" xmlns:cx8="http://schemas.microsoft.com/office/drawing/2016/5/14/chartex" xmlns:mc="http://schemas.openxmlformats.org/markup-compatibility/2006" xmlns:aink="http://schemas.microsoft.com/office/drawing/2016/ink" xmlns:am3d="http://schemas.microsoft.com/office/drawing/2017/model3d" xmlns:o="urn:schemas-microsoft-com:office:office" xmlns:oel="http://schemas.microsoft.com/office/2019/extlst" xmlns:r="http://schemas.openxmlformats.org/officeDocument/2006/relationships" xmlns:m="http://schemas.openxmlformats.org/officeDocument/2006/math" xmlns:v="urn:schemas-microsoft-com:vml" xmlns:wp14="http://schemas.microsoft.com/office/word/2010/wordprocessingDrawing" xmlns:wp="http://schemas.openxmlformats.org/drawingml/2006/wordprocessingDrawing" xmlns:w10="urn:schemas-microsoft-com:office:word" xmlns:w="http://schemas.openxmlformats.org/wordprocessingml/2006/main" xmlns:w14="http://schemas.microsoft.com/office/word/2010/wordml" xmlns:w15="http://schemas.microsoft.com/office/word/2012/wordml" xmlns:w16cex="http://schemas.microsoft.com/office/word/2018/wordml/cex" xmlns:w16cid="http://schemas.microsoft.com/office/word/2016/wordml/cid" xmlns:w16="http://schemas.microsoft.com/office/word/2018/wordml" xmlns:w16du="http://schemas.microsoft.com/office/word/2023/wordml/word16du" xmlns:w16sdtdh="http://schemas.microsoft.com/office/word/2020/wordml/sdtdatahash" xmlns:w16sdtfl="http://schemas.microsoft.com/office/word/2024/wordml/sdtformatlock" xmlns:w16se="http://schemas.microsoft.com/office/word/2015/wordml/symex" xmlns:wpg="http://schemas.microsoft.com/office/word/2010/wordprocessingGroup" xmlns:wpi="http://schemas.microsoft.com/office/word/2010/wordprocessingInk" xmlns:wne="http://schemas.microsoft.com/office/word/2006/wordml" xmlns:wps="http://schemas.microsoft.com/office/word/2010/wordprocessingShape" mc:Ignorable="w14 w15 w16se w16cid w16 w16cex w16sdtdh w16sdtfl w16du wp14">
   <w:footnote w:type="separator" w:id="-1">
     <w:p>
@@ -1390,7 +1306,7 @@
 </w:footnotes>
 </file>
 
-<file path=word\header1.xml><?xml version="1.0" encoding="utf-8"?>
+<file path=word/header1.xml><?xml version="1.0" encoding="utf-8"?>
 <w:hdr xmlns:wpc="http://schemas.microsoft.com/office/word/2010/wordprocessingCanvas" xmlns:cx="http://schemas.microsoft.com/office/drawing/2014/chartex" xmlns:cx1="http://schemas.microsoft.com/office/drawing/2015/9/8/chartex" xmlns:cx2="http://schemas.microsoft.com/office/drawing/2015/10/21/chartex" xmlns:cx3="http://schemas.microsoft.com/office/drawing/2016/5/9/chartex" xmlns:cx4="http://schemas.microsoft.com/office/drawing/2016/5/10/chartex" xmlns:cx5="http://schemas.microsoft.com/office/drawing/2016/5/11/chartex" xmlns:cx6="http://schemas.microsoft.com/office/drawing/2016/5/12/chartex" xmlns:cx7="http://schemas.microsoft.com/office/drawing/2016/5/13/chartex" xmlns:cx8="http://schemas.microsoft.com/office/drawing/2016/5/14/chartex" xmlns:mc="http://schemas.openxmlformats.org/markup-compatibility/2006" xmlns:aink="http://schemas.microsoft.com/office/drawing/2016/ink" xmlns:am3d="http://schemas.microsoft.com/office/drawing/2017/model3d" xmlns:o="urn:schemas-microsoft-com:office:office" xmlns:oel="http://schemas.microsoft.com/office/2019/extlst" xmlns:r="http://schemas.openxmlformats.org/officeDocument/2006/relationships" xmlns:m="http://schemas.openxmlformats.org/officeDocument/2006/math" xmlns:v="urn:schemas-microsoft-com:vml" xmlns:wp14="http://schemas.microsoft.com/office/word/2010/wordprocessingDrawing" xmlns:wp="http://schemas.openxmlformats.org/drawingml/2006/wordprocessingDrawing" xmlns:w10="urn:schemas-microsoft-com:office:word" xmlns:w="http://schemas.openxmlformats.org/wordprocessingml/2006/main" xmlns:w14="http://schemas.microsoft.com/office/word/2010/wordml" xmlns:w15="http://schemas.microsoft.com/office/word/2012/wordml" xmlns:w16cex="http://schemas.microsoft.com/office/word/2018/wordml/cex" xmlns:w16cid="http://schemas.microsoft.com/office/word/2016/wordml/cid" xmlns:w16="http://schemas.microsoft.com/office/word/2018/wordml" xmlns:w16du="http://schemas.microsoft.com/office/word/2023/wordml/word16du" xmlns:w16sdtdh="http://schemas.microsoft.com/office/word/2020/wordml/sdtdatahash" xmlns:w16sdtfl="http://schemas.microsoft.com/office/word/2024/wordml/sdtformatlock" xmlns:w16se="http://schemas.microsoft.com/office/word/2015/wordml/symex" xmlns:wpg="http://schemas.microsoft.com/office/word/2010/wordprocessingGroup" xmlns:wpi="http://schemas.microsoft.com/office/word/2010/wordprocessingInk" xmlns:wne="http://schemas.microsoft.com/office/word/2006/wordml" xmlns:wps="http://schemas.microsoft.com/office/word/2010/wordprocessingShape" mc:Ignorable="w14 w15 w16se w16cid w16 w16cex w16sdtdh w16sdtfl w16du wp14">
   <w:p>
     <w:pPr>
@@ -1460,7 +1376,7 @@
 </w:hdr>
 </file>
 
-<file path=word\numbering.xml><?xml version="1.0" encoding="utf-8"?>
+<file path=word/numbering.xml><?xml version="1.0" encoding="utf-8"?>
 <w:numbering xmlns:wpc="http://schemas.microsoft.com/office/word/2010/wordprocessingCanvas" xmlns:cx="http://schemas.microsoft.com/office/drawing/2014/chartex" xmlns:cx1="http://schemas.microsoft.com/office/drawing/2015/9/8/chartex" xmlns:cx2="http://schemas.microsoft.com/office/drawing/2015/10/21/chartex" xmlns:cx3="http://schemas.microsoft.com/office/drawing/2016/5/9/chartex" xmlns:cx4="http://schemas.microsoft.com/office/drawing/2016/5/10/chartex" xmlns:cx5="http://schemas.microsoft.com/office/drawing/2016/5/11/chartex" xmlns:cx6="http://schemas.microsoft.com/office/drawing/2016/5/12/chartex" xmlns:cx7="http://schemas.microsoft.com/office/drawing/2016/5/13/chartex" xmlns:cx8="http://schemas.microsoft.com/office/drawing/2016/5/14/chartex" xmlns:mc="http://schemas.openxmlformats.org/markup-compatibility/2006" xmlns:aink="http://schemas.microsoft.com/office/drawing/2016/ink" xmlns:am3d="http://schemas.microsoft.com/office/drawing/2017/model3d" xmlns:o="urn:schemas-microsoft-com:office:office" xmlns:oel="http://schemas.microsoft.com/office/2019/extlst" xmlns:r="http://schemas.openxmlformats.org/officeDocument/2006/relationships" xmlns:m="http://schemas.openxmlformats.org/officeDocument/2006/math" xmlns:v="urn:schemas-microsoft-com:vml" xmlns:wp14="http://schemas.microsoft.com/office/word/2010/wordprocessingDrawing" xmlns:wp="http://schemas.openxmlformats.org/drawingml/2006/wordprocessingDrawing" xmlns:w10="urn:schemas-microsoft-com:office:word" xmlns:w="http://schemas.openxmlformats.org/wordprocessingml/2006/main" xmlns:w14="http://schemas.microsoft.com/office/word/2010/wordml" xmlns:w15="http://schemas.microsoft.com/office/word/2012/wordml" xmlns:w16cex="http://schemas.microsoft.com/office/word/2018/wordml/cex" xmlns:w16cid="http://schemas.microsoft.com/office/word/2016/wordml/cid" xmlns:w16="http://schemas.microsoft.com/office/word/2018/wordml" xmlns:w16du="http://schemas.microsoft.com/office/word/2023/wordml/word16du" xmlns:w16sdtdh="http://schemas.microsoft.com/office/word/2020/wordml/sdtdatahash" xmlns:w16sdtfl="http://schemas.microsoft.com/office/word/2024/wordml/sdtformatlock" xmlns:w16se="http://schemas.microsoft.com/office/word/2015/wordml/symex" xmlns:wpg="http://schemas.microsoft.com/office/word/2010/wordprocessingGroup" xmlns:wpi="http://schemas.microsoft.com/office/word/2010/wordprocessingInk" xmlns:wne="http://schemas.microsoft.com/office/word/2006/wordml" xmlns:wps="http://schemas.microsoft.com/office/word/2010/wordprocessingShape" mc:Ignorable="w14 w15 w16se w16cid w16 w16cex w16sdtdh w16sdtfl w16du wp14">
   <w:abstractNum w:abstractNumId="0" w15:restartNumberingAfterBreak="0">
     <w:nsid w:val="689E407D"/>
@@ -1554,163 +1470,7 @@
 </w:numbering>
 </file>
 
-<file path=word\settings.xml><?xml version="1.0" encoding="utf-8"?>
-<w:settings xmlns:mc="http://schemas.openxmlformats.org/markup-compatibility/2006" xmlns:o="urn:schemas-microsoft-com:office:office" xmlns:r="http://schemas.openxmlformats.org/officeDocument/2006/relationships" xmlns:m="http://schemas.openxmlformats.org/officeDocument/2006/math" xmlns:v="urn:schemas-microsoft-com:vml" xmlns:w10="urn:schemas-microsoft-com:office:word" xmlns:w="http://schemas.openxmlformats.org/wordprocessingml/2006/main" xmlns:w14="http://schemas.microsoft.com/office/word/2010/wordml" xmlns:w15="http://schemas.microsoft.com/office/word/2012/wordml" xmlns:w16cex="http://schemas.microsoft.com/office/word/2018/wordml/cex" xmlns:w16cid="http://schemas.microsoft.com/office/word/2016/wordml/cid" xmlns:w16="http://schemas.microsoft.com/office/word/2018/wordml" xmlns:w16du="http://schemas.microsoft.com/office/word/2023/wordml/word16du" xmlns:w16sdtdh="http://schemas.microsoft.com/office/word/2020/wordml/sdtdatahash" xmlns:w16sdtfl="http://schemas.microsoft.com/office/word/2024/wordml/sdtformatlock" xmlns:w16se="http://schemas.microsoft.com/office/word/2015/wordml/symex" xmlns:sl="http://schemas.openxmlformats.org/schemaLibrary/2006/main" mc:Ignorable="w14 w15 w16se w16cid w16 w16cex w16sdtdh w16sdtfl w16du">
-  <w:zoom w:percent="100"/>
-  <w:defaultTabStop w:val="720"/>
-  <w:characterSpacingControl w:val="doNotCompress"/>
-  <w:hdrShapeDefaults>
-    <o:shapedefaults v:ext="edit" spidmax="2050"/>
-  </w:hdrShapeDefaults>
-  <w:footnotePr>
-    <w:footnote w:id="-1"/>
-    <w:footnote w:id="0"/>
-  </w:footnotePr>
-  <w:endnotePr>
-    <w:endnote w:id="-1"/>
-    <w:endnote w:id="0"/>
-  </w:endnotePr>
-  <w:compat>
-    <w:compatSetting w:name="compatibilityMode" w:uri="http://schemas.microsoft.com/office/word" w:val="15"/>
-    <w:compatSetting w:name="overrideTableStyleFontSizeAndJustification" w:uri="http://schemas.microsoft.com/office/word" w:val="1"/>
-    <w:compatSetting w:name="enableOpenTypeFeatures" w:uri="http://schemas.microsoft.com/office/word" w:val="1"/>
-    <w:compatSetting w:name="doNotFlipMirrorIndents" w:uri="http://schemas.microsoft.com/office/word" w:val="1"/>
-    <w:compatSetting w:name="differentiateMultirowTableHeaders" w:uri="http://schemas.microsoft.com/office/word" w:val="1"/>
-    <w:compatSetting w:name="useWord2013TrackBottomHyphenation" w:uri="http://schemas.microsoft.com/office/word" w:val="0"/>
-  </w:compat>
-  <w:rsids>
-    <w:rsidRoot w:val="00DD5A9F"/>
-    <w:rsid w:val="000359A7"/>
-    <w:rsid w:val="00045976"/>
-    <w:rsid w:val="00090DDD"/>
-    <w:rsid w:val="000A3428"/>
-    <w:rsid w:val="000D459D"/>
-    <w:rsid w:val="001324DE"/>
-    <w:rsid w:val="001407EA"/>
-    <w:rsid w:val="0015364A"/>
-    <w:rsid w:val="0018053B"/>
-    <w:rsid w:val="001C3147"/>
-    <w:rsid w:val="001F0993"/>
-    <w:rsid w:val="001F403E"/>
-    <w:rsid w:val="0020386E"/>
-    <w:rsid w:val="00291058"/>
-    <w:rsid w:val="002D65E4"/>
-    <w:rsid w:val="002E508A"/>
-    <w:rsid w:val="00302823"/>
-    <w:rsid w:val="00304C7C"/>
-    <w:rsid w:val="00326693"/>
-    <w:rsid w:val="003301A9"/>
-    <w:rsid w:val="00333E4C"/>
-    <w:rsid w:val="00404D61"/>
-    <w:rsid w:val="0041277C"/>
-    <w:rsid w:val="004816B5"/>
-    <w:rsid w:val="004A2808"/>
-    <w:rsid w:val="004D0423"/>
-    <w:rsid w:val="004D1209"/>
-    <w:rsid w:val="00516EC9"/>
-    <w:rsid w:val="00545008"/>
-    <w:rsid w:val="00555868"/>
-    <w:rsid w:val="00556403"/>
-    <w:rsid w:val="00587FE1"/>
-    <w:rsid w:val="005A2678"/>
-    <w:rsid w:val="00621837"/>
-    <w:rsid w:val="006670BB"/>
-    <w:rsid w:val="0067234A"/>
-    <w:rsid w:val="006B7361"/>
-    <w:rsid w:val="006D2334"/>
-    <w:rsid w:val="006D2EFC"/>
-    <w:rsid w:val="006D2F50"/>
-    <w:rsid w:val="006F4F17"/>
-    <w:rsid w:val="006F5BD3"/>
-    <w:rsid w:val="00736E9C"/>
-    <w:rsid w:val="007568AA"/>
-    <w:rsid w:val="0077611C"/>
-    <w:rsid w:val="00785DA3"/>
-    <w:rsid w:val="007A6F0C"/>
-    <w:rsid w:val="008303D1"/>
-    <w:rsid w:val="008305BB"/>
-    <w:rsid w:val="00867D72"/>
-    <w:rsid w:val="008C3751"/>
-    <w:rsid w:val="008C76B4"/>
-    <w:rsid w:val="008E2544"/>
-    <w:rsid w:val="0095091A"/>
-    <w:rsid w:val="00952D8A"/>
-    <w:rsid w:val="009A0CA4"/>
-    <w:rsid w:val="009B0AD5"/>
-    <w:rsid w:val="009B6AF4"/>
-    <w:rsid w:val="009D1DC5"/>
-    <w:rsid w:val="009D2012"/>
-    <w:rsid w:val="009D2CF8"/>
-    <w:rsid w:val="00A01917"/>
-    <w:rsid w:val="00A10B9E"/>
-    <w:rsid w:val="00A54669"/>
-    <w:rsid w:val="00A63068"/>
-    <w:rsid w:val="00AB7C81"/>
-    <w:rsid w:val="00AF5E2C"/>
-    <w:rsid w:val="00B039FE"/>
-    <w:rsid w:val="00B32408"/>
-    <w:rsid w:val="00B45305"/>
-    <w:rsid w:val="00B82C1A"/>
-    <w:rsid w:val="00B83F05"/>
-    <w:rsid w:val="00BA6678"/>
-    <w:rsid w:val="00BF433B"/>
-    <w:rsid w:val="00C102A3"/>
-    <w:rsid w:val="00C437E2"/>
-    <w:rsid w:val="00C57A0C"/>
-    <w:rsid w:val="00C82635"/>
-    <w:rsid w:val="00CB5A74"/>
-    <w:rsid w:val="00CB7968"/>
-    <w:rsid w:val="00CD74DE"/>
-    <w:rsid w:val="00CF1847"/>
-    <w:rsid w:val="00D26FE0"/>
-    <w:rsid w:val="00D27DEF"/>
-    <w:rsid w:val="00D37ACF"/>
-    <w:rsid w:val="00D6069A"/>
-    <w:rsid w:val="00D67067"/>
-    <w:rsid w:val="00D8320D"/>
-    <w:rsid w:val="00D957C0"/>
-    <w:rsid w:val="00DA64EF"/>
-    <w:rsid w:val="00DD5A9F"/>
-    <w:rsid w:val="00E04D7A"/>
-    <w:rsid w:val="00E411B7"/>
-    <w:rsid w:val="00E47D5A"/>
-    <w:rsid w:val="00EA4F25"/>
-    <w:rsid w:val="00EB3692"/>
-    <w:rsid w:val="00EE16BF"/>
-    <w:rsid w:val="00F1784D"/>
-    <w:rsid w:val="00F947D3"/>
-    <w:rsid w:val="00F97076"/>
-    <w:rsid w:val="00FE4A3E"/>
-  </w:rsids>
-  <m:mathPr>
-    <m:mathFont m:val="Cambria Math"/>
-    <m:brkBin m:val="before"/>
-    <m:brkBinSub m:val="--"/>
-    <m:smallFrac m:val="0"/>
-    <m:dispDef/>
-    <m:lMargin m:val="0"/>
-    <m:rMargin m:val="0"/>
-    <m:defJc m:val="centerGroup"/>
-    <m:wrapIndent m:val="1440"/>
-    <m:intLim m:val="subSup"/>
-    <m:naryLim m:val="undOvr"/>
-  </m:mathPr>
-  <w:themeFontLang w:val="en-US"/>
-  <w:clrSchemeMapping w:bg1="light1" w:t1="dark1" w:bg2="light2" w:t2="dark2" w:accent1="accent1" w:accent2="accent2" w:accent3="accent3" w:accent4="accent4" w:accent5="accent5" w:accent6="accent6" w:hyperlink="hyperlink" w:followedHyperlink="followedHyperlink"/>
-  <w:shapeDefaults>
-    <o:shapedefaults v:ext="edit" spidmax="2050"/>
-    <o:shapelayout v:ext="edit">
-      <o:idmap v:ext="edit" data="2"/>
-    </o:shapelayout>
-  </w:shapeDefaults>
-  <w:decimalSymbol w:val=","/>
-  <w:listSeparator w:val=";"/>
-  <w14:docId w14:val="042CEE11"/>
-  <w15:docId w15:val="{2F0EB663-7E86-4BC2-922A-CB72D874DD46}"/>
-</w:settings>
-</file>
-
-<file path=word\styles.xml><?xml version="1.0" encoding="utf-8"?>
+<file path=word/styles.xml><?xml version="1.0" encoding="utf-8"?>
 <w:styles xmlns:mc="http://schemas.openxmlformats.org/markup-compatibility/2006" xmlns:r="http://schemas.openxmlformats.org/officeDocument/2006/relationships" xmlns:w="http://schemas.openxmlformats.org/wordprocessingml/2006/main" xmlns:w14="http://schemas.microsoft.com/office/word/2010/wordml" xmlns:w15="http://schemas.microsoft.com/office/word/2012/wordml" xmlns:w16cex="http://schemas.microsoft.com/office/word/2018/wordml/cex" xmlns:w16cid="http://schemas.microsoft.com/office/word/2016/wordml/cid" xmlns:w16="http://schemas.microsoft.com/office/word/2018/wordml" xmlns:w16du="http://schemas.microsoft.com/office/word/2023/wordml/word16du" xmlns:w16sdtdh="http://schemas.microsoft.com/office/word/2020/wordml/sdtdatahash" xmlns:w16sdtfl="http://schemas.microsoft.com/office/word/2024/wordml/sdtformatlock" xmlns:w16se="http://schemas.microsoft.com/office/word/2015/wordml/symex" mc:Ignorable="w14 w15 w16se w16cid w16 w16cex w16sdtdh w16sdtfl w16du">
   <w:docDefaults>
     <w:rPrDefault>
@@ -2236,7 +1996,7 @@
 </w:styles>
 </file>
 
-<file path=word\theme\theme1.xml><?xml version="1.0" encoding="utf-8"?>
+<file path=word/theme/theme1.xml><?xml version="1.0" encoding="utf-8"?>
 <a:theme xmlns:a="http://schemas.openxmlformats.org/drawingml/2006/main" name="Office Theme">
   <a:themeElements>
     <a:clrScheme name="Office">
@@ -2519,12 +2279,4 @@
   <a:objectDefaults/>
   <a:extraClrSchemeLst/>
 </a:theme>
-</file>
-
-<file path=word\webSettings.xml><?xml version="1.0" encoding="utf-8"?>
-<w:webSettings xmlns:mc="http://schemas.openxmlformats.org/markup-compatibility/2006" xmlns:r="http://schemas.openxmlformats.org/officeDocument/2006/relationships" xmlns:w="http://schemas.openxmlformats.org/wordprocessingml/2006/main" xmlns:w14="http://schemas.microsoft.com/office/word/2010/wordml" xmlns:w15="http://schemas.microsoft.com/office/word/2012/wordml" xmlns:w16cex="http://schemas.microsoft.com/office/word/2018/wordml/cex" xmlns:w16cid="http://schemas.microsoft.com/office/word/2016/wordml/cid" xmlns:w16="http://schemas.microsoft.com/office/word/2018/wordml" xmlns:w16du="http://schemas.microsoft.com/office/word/2023/wordml/word16du" xmlns:w16sdtdh="http://schemas.microsoft.com/office/word/2020/wordml/sdtdatahash" xmlns:w16sdtfl="http://schemas.microsoft.com/office/word/2024/wordml/sdtformatlock" xmlns:w16se="http://schemas.microsoft.com/office/word/2015/wordml/symex" mc:Ignorable="w14 w15 w16se w16cid w16 w16cex w16sdtdh w16sdtfl w16du">
-  <w:optimizeForBrowser/>
-  <w:relyOnVML/>
-  <w:allowPNG/>
-</w:webSettings>
 </file>
</xml_diff>